<commit_message>
Adjust RF signal cap to 100 percent
Co-authored-by: Copilot App <223556219+Copilot@users.noreply.github.com>
</commit_message>
<xml_diff>
--- a/docs/SatAlign_ESP32_V3_Gesamtdokumentation.docx
+++ b/docs/SatAlign_ESP32_V3_Gesamtdokumentation.docx
@@ -3838,7 +3838,7 @@
           </w:tcPr>
           <w:p>
             <w:r>
-              <w:t>95 %</w:t>
+              <w:t>100 %</w:t>
             </w:r>
           </w:p>
         </w:tc>
@@ -3855,7 +3855,7 @@
           </w:tcPr>
           <w:p>
             <w:r>
-              <w:t>Bewusste Deckelung des nutzbaren Prozentwerts.</w:t>
+              <w:t>Begrenzung des gemeinsamen RF-Prozentwerts auf den normalen Bereich 0..100 %.</w:t>
             </w:r>
           </w:p>
         </w:tc>
@@ -4245,7 +4245,7 @@
     <w:p>
       <w:pPr/>
       <w:r>
-        <w:t>RF-Logik bis V3.1.4: In V3.0.4 wurden die RF-Prozentwerte fuer die TFT-Anzeige und die AUTO-Suche ueber unterschiedliche Kennlinien berechnet. Ab V3.1.1 verwenden Anzeige und AUTO-Suche deshalb dieselbe zentrale RF-Normierung (rfGetSignalNorm/rfGetSignalPercent). V3.1.2 begrenzte den gemeinsamen RF-Prozentwert auf maximal 95 %. V3.1.3 setzte nach Aussentests die normale AUTO-Kandidatenschwelle auf 80 % und reduzierte RF_FILTER_ALPHA von 0,90 auf 0,75. Fuer V3.1.4 wurde ein eigenstaendiger, reproduzierbarer RF-/Azimut-Test ausgefuehrt. Dabei wurden aus denselben Rohdaten parallel Filterfaktoren 0,75, 0,50 und 0,25 ausgewertet. 0,75 reagierte sichtbar traeger auf reale Signalveraenderungen, 0,25 uebernahm Rohwertschwankungen staerker. Deshalb verwendet V3.1.4 RF_FILTER_ALPHA = 0,50 als Kompromiss aus Reaktionsgeschwindigkeit und Glaettung. Die 80-%-Mindestschwelle und die 95-%-Obergrenze bleiben unveraendert. In der seriellen Statuszeile heisst der MPU6050-Winkelwert ANGLE_FILTER, um ihn eindeutig vom RF_DIAG-Filterwert zu unterscheiden.</w:t>
+        <w:t>RF-Logik bis V3.1.4: In V3.0.4 wurden die RF-Prozentwerte fuer die TFT-Anzeige und die AUTO-Suche ueber unterschiedliche Kennlinien berechnet. Ab V3.1.1 verwenden Anzeige und AUTO-Suche deshalb dieselbe zentrale RF-Normierung (rfGetSignalNorm/rfGetSignalPercent). V3.1.2 begrenzte den gemeinsamen RF-Prozentwert auf maximal 95 %. V3.1.3 setzte nach Aussentests die normale AUTO-Kandidatenschwelle auf 80 % und reduzierte RF_FILTER_ALPHA von 0,90 auf 0,75. Fuer V3.1.4 wurde ein eigenstaendiger, reproduzierbarer RF-/Azimut-Test ausgefuehrt. Dabei wurden aus denselben Rohdaten parallel Filterfaktoren 0,75, 0,50 und 0,25 ausgewertet. 0,75 reagierte sichtbar traeger auf reale Signalveraenderungen, 0,25 uebernahm Rohwertschwankungen staerker. Deshalb verwendet V3.1.4 RF_FILTER_ALPHA = 0,50 als Kompromiss aus Reaktionsgeschwindigkeit und Glaettung. Die 80-%-Mindestschwelle bleibt unveraendert; im aktuellen V3.1.4-Projektstand wurde die gemeinsame RF-Obergrenze von 95 % auf 100 % angehoben. In der seriellen Statuszeile heisst der MPU6050-Winkelwert ANGLE_FILTER, um ihn eindeutig vom RF_DIAG-Filterwert zu unterscheiden.</w:t>
       </w:r>
     </w:p>
     <w:p>
@@ -5536,7 +5536,7 @@
         <w:spacing w:after="100" w:line="259" w:lineRule="auto"/>
       </w:pPr>
       <w:r>
-        <w:t>V3.1.4 verwendet keine automatische Nachoptimierung nach PLUS. Stattdessen werden RF-Anzeige und AUTO-Suche aus derselben zentralen Prozentbewertung gespeist. RF_FILTER_ALPHA = 0,50, die normale AUTO-Kandidatenschwelle betraegt 80 %, und die nutzbare Anzeige wird bei 95 % gedeckelt. Fuer Feldtests erzeugt ein kompletter AUTO-Lauf einen kopierbaren Block zwischen AUTO_LOG_BEGIN und AUTO_LOG_END. AZPOS ist dabei nur ein Diagnosewert und kein echter Encoderwert.</w:t>
+        <w:t>V3.1.4 verwendet keine automatische Nachoptimierung nach PLUS. Stattdessen werden RF-Anzeige und AUTO-Suche aus derselben zentralen Prozentbewertung gespeist. RF_FILTER_ALPHA = 0,50, die normale AUTO-Kandidatenschwelle betraegt 80 %, und die gemeinsame RF-Anzeige wird bei 100 % begrenzt. Fuer Feldtests erzeugt ein kompletter AUTO-Lauf einen kopierbaren Block zwischen AUTO_LOG_BEGIN und AUTO_LOG_END. AZPOS ist dabei nur ein Diagnosewert und kein echter Encoderwert.</w:t>
       </w:r>
     </w:p>
     <w:tbl>

</xml_diff>